<commit_message>
Add terminal commands for checking and installing Python 3 on macOS
</commit_message>
<xml_diff>
--- a/DropFile_macOS_Installation_Guide.docx
+++ b/DropFile_macOS_Installation_Guide.docx
@@ -161,7 +161,7 @@
           <w:color w:val="202124"/>
           <w:sz w:val="28"/>
         </w:rPr>
-        <w:t>2. Проверка наличия Python 3 на Mac</w:t>
+        <w:t>2. Проверка и установка Python 3 на Mac</w:t>
       </w:r>
     </w:p>
     <w:p>
@@ -173,7 +173,7 @@
           <w:rFonts w:ascii="Arial" w:hAnsi="Arial"/>
           <w:sz w:val="20"/>
         </w:rPr>
-        <w:t>Откройте программу Терминал (Terminal.app — находится в папке Программы -&gt; Утилиты или через поиск Spotlight) и выполните команду:</w:t>
+        <w:t>Откройте программу Терминал (Terminal.app — находится в папке Программы -&gt; Утилиты или через Spotlight Cmd+Пробел) и выполните команды проверки:</w:t>
       </w:r>
     </w:p>
     <w:tbl>
@@ -209,6 +209,10 @@
                 <w:sz w:val="19"/>
               </w:rPr>
               <w:t>python3 --version</w:t>
+              <w:br/>
+              <w:t>which python3</w:t>
+              <w:br/>
+              <w:t>python3 -m tkinter</w:t>
             </w:r>
           </w:p>
         </w:tc>
@@ -228,10 +232,10 @@
           <w:rFonts w:ascii="Arial" w:hAnsi="Arial"/>
           <w:sz w:val="20"/>
         </w:rPr>
-        <w:t>Если в ответ отобразилась версия (например, Python 3.9.x, 3.10.x или 3.12.x) — окружение готово. Переходите к Шагу 3.</w:t>
+        <w:t>Если отобразилась версия (например, Python 3.9+ или 3.11+) и открылось тестовое окно Tkinter — всё готово, переходите к Шагу 3.</w:t>
         <w:br/>
         <w:br/>
-        <w:t>Если система вывела ошибку 'command not found' (часто встречается на чистой macOS 10.15 Catalina), установите Python 3 одним из двух простых способов:</w:t>
+        <w:t>Если появилось 'command not found' или 'No module named _tkinter', установите Python 3 с помощью готовых терминальных команд:</w:t>
       </w:r>
     </w:p>
     <w:tbl>
@@ -273,7 +277,7 @@
                 <w:color w:val="1A73E8"/>
                 <w:sz w:val="20"/>
               </w:rPr>
-              <w:t>📦 УСТАНОВКА PYTHON 3 НА MACOS</w:t>
+              <w:t>📦 КОМАНДЫ ДЛЯ УСТАНОВКИ PYTHON 3 НА MACOS</w:t>
               <w:br/>
             </w:r>
           </w:p>
@@ -287,7 +291,7 @@
                 <w:color w:val="202124"/>
                 <w:sz w:val="19"/>
               </w:rPr>
-              <w:t>Способ А (Самый надежный): Скачайте официальный дистрибутив с сайта https://www.python.org/downloads/macos/ (выберите установщик 'macOS 64-bit universal2 installer') и установите его в пару кликов.</w:t>
+              <w:t>Способ 1 (Рекомендуется ⭐, в 1 строку через curl):</w:t>
             </w:r>
           </w:p>
           <w:p>
@@ -300,7 +304,7 @@
                 <w:color w:val="202124"/>
                 <w:sz w:val="19"/>
               </w:rPr>
-              <w:t>Способ Б (Через Xcode CLI): Выполните в Терминале команду xcode-select --install и подтвердите установку инструментов разработчика Apple в появившемся диалоговом окне.</w:t>
+              <w:t>curl -O https://www.python.org/ftp/python/3.11.9/python-3.11.9-macos11.pkg</w:t>
             </w:r>
           </w:p>
           <w:p>
@@ -313,7 +317,96 @@
                 <w:color w:val="202124"/>
                 <w:sz w:val="19"/>
               </w:rPr>
-              <w:t>Способ В (Через Homebrew): Если у вас установлен менеджер пакетов Homebrew, выполните: brew install python</w:t>
+              <w:t>sudo installer -pkg python-3.11.9-macos11.pkg -target /</w:t>
+            </w:r>
+          </w:p>
+          <w:p>
+            <w:pPr>
+              <w:spacing w:before="40" w:after="40"/>
+            </w:pPr>
+            <w:r>
+              <w:rPr>
+                <w:rFonts w:ascii="Arial" w:hAnsi="Arial"/>
+                <w:color w:val="202124"/>
+                <w:sz w:val="19"/>
+              </w:rPr>
+              <w:t>"/Applications/Python 3.11/Install Certificates.command"</w:t>
+            </w:r>
+          </w:p>
+          <w:p>
+            <w:pPr>
+              <w:spacing w:before="40" w:after="40"/>
+            </w:pPr>
+            <w:r>
+              <w:rPr>
+                <w:rFonts w:ascii="Arial" w:hAnsi="Arial"/>
+                <w:color w:val="202124"/>
+                <w:sz w:val="19"/>
+              </w:rPr>
+            </w:r>
+          </w:p>
+          <w:p>
+            <w:pPr>
+              <w:spacing w:before="40" w:after="40"/>
+            </w:pPr>
+            <w:r>
+              <w:rPr>
+                <w:rFonts w:ascii="Arial" w:hAnsi="Arial"/>
+                <w:color w:val="202124"/>
+                <w:sz w:val="19"/>
+              </w:rPr>
+              <w:t>Способ 2 (Штатный через инструменты Apple Command Line Tools):</w:t>
+            </w:r>
+          </w:p>
+          <w:p>
+            <w:pPr>
+              <w:spacing w:before="40" w:after="40"/>
+            </w:pPr>
+            <w:r>
+              <w:rPr>
+                <w:rFonts w:ascii="Arial" w:hAnsi="Arial"/>
+                <w:color w:val="202124"/>
+                <w:sz w:val="19"/>
+              </w:rPr>
+              <w:t>xcode-select --install</w:t>
+            </w:r>
+          </w:p>
+          <w:p>
+            <w:pPr>
+              <w:spacing w:before="40" w:after="40"/>
+            </w:pPr>
+            <w:r>
+              <w:rPr>
+                <w:rFonts w:ascii="Arial" w:hAnsi="Arial"/>
+                <w:color w:val="202124"/>
+                <w:sz w:val="19"/>
+              </w:rPr>
+            </w:r>
+          </w:p>
+          <w:p>
+            <w:pPr>
+              <w:spacing w:before="40" w:after="40"/>
+            </w:pPr>
+            <w:r>
+              <w:rPr>
+                <w:rFonts w:ascii="Arial" w:hAnsi="Arial"/>
+                <w:color w:val="202124"/>
+                <w:sz w:val="19"/>
+              </w:rPr>
+              <w:t>Способ 3 (Через менеджер пакетов Homebrew):</w:t>
+            </w:r>
+          </w:p>
+          <w:p>
+            <w:pPr>
+              <w:spacing w:before="40" w:after="40"/>
+            </w:pPr>
+            <w:r>
+              <w:rPr>
+                <w:rFonts w:ascii="Arial" w:hAnsi="Arial"/>
+                <w:color w:val="202124"/>
+                <w:sz w:val="19"/>
+              </w:rPr>
+              <w:t>brew install python python-tk</w:t>
             </w:r>
           </w:p>
         </w:tc>

</xml_diff>